<commit_message>
added jira to documentation
</commit_message>
<xml_diff>
--- a/Dokumentáció/Fejlesztoisablon.docx
+++ b/Dokumentáció/Fejlesztoisablon.docx
@@ -6740,191 +6740,15 @@
       <w:pPr>
         <w:ind w:firstLine="0"/>
       </w:pPr>
-      <w:r>
-        <w:lastRenderedPageBreak/>
-        <w:drawing>
-          <wp:anchor distT="0" distB="0" distL="114300" distR="114300" simplePos="0" relativeHeight="251683840" behindDoc="0" locked="0" layoutInCell="1" allowOverlap="1" wp14:anchorId="1C6B03FB" wp14:editId="4968C3C5">
-            <wp:simplePos x="0" y="0"/>
-            <wp:positionH relativeFrom="margin">
-              <wp:align>center</wp:align>
-            </wp:positionH>
-            <wp:positionV relativeFrom="paragraph">
-              <wp:posOffset>5771791</wp:posOffset>
-            </wp:positionV>
-            <wp:extent cx="3654425" cy="2599690"/>
-            <wp:effectExtent l="0" t="0" r="3175" b="0"/>
-            <wp:wrapTopAndBottom/>
-            <wp:docPr id="21" name="Kép 21"/>
-            <wp:cNvGraphicFramePr>
-              <a:graphicFrameLocks xmlns:a="http://schemas.openxmlformats.org/drawingml/2006/main" noChangeAspect="1"/>
-            </wp:cNvGraphicFramePr>
-            <a:graphic xmlns:a="http://schemas.openxmlformats.org/drawingml/2006/main">
-              <a:graphicData uri="http://schemas.openxmlformats.org/drawingml/2006/picture">
-                <pic:pic xmlns:pic="http://schemas.openxmlformats.org/drawingml/2006/picture">
-                  <pic:nvPicPr>
-                    <pic:cNvPr id="1" name=""/>
-                    <pic:cNvPicPr/>
-                  </pic:nvPicPr>
-                  <pic:blipFill rotWithShape="1">
-                    <a:blip r:embed="rId21">
-                      <a:extLst>
-                        <a:ext uri="{28A0092B-C50C-407E-A947-70E740481C1C}">
-                          <a14:useLocalDpi xmlns:a14="http://schemas.microsoft.com/office/drawing/2010/main" val="0"/>
-                        </a:ext>
-                      </a:extLst>
-                    </a:blip>
-                    <a:srcRect b="6771"/>
-                    <a:stretch/>
-                  </pic:blipFill>
-                  <pic:spPr bwMode="auto">
-                    <a:xfrm>
-                      <a:off x="0" y="0"/>
-                      <a:ext cx="3654425" cy="2599690"/>
-                    </a:xfrm>
-                    <a:prstGeom prst="rect">
-                      <a:avLst/>
-                    </a:prstGeom>
-                    <a:ln>
-                      <a:noFill/>
-                    </a:ln>
-                    <a:extLst>
-                      <a:ext uri="{53640926-AAD7-44D8-BBD7-CCE9431645EC}">
-                        <a14:shadowObscured xmlns:a14="http://schemas.microsoft.com/office/drawing/2010/main"/>
-                      </a:ext>
-                    </a:extLst>
-                  </pic:spPr>
-                </pic:pic>
-              </a:graphicData>
-            </a:graphic>
-            <wp14:sizeRelH relativeFrom="margin">
-              <wp14:pctWidth>0</wp14:pctWidth>
-            </wp14:sizeRelH>
-            <wp14:sizeRelV relativeFrom="margin">
-              <wp14:pctHeight>0</wp14:pctHeight>
-            </wp14:sizeRelV>
-          </wp:anchor>
-        </w:drawing>
-      </w:r>
-      <w:r>
-        <w:drawing>
-          <wp:anchor distT="0" distB="0" distL="114300" distR="114300" simplePos="0" relativeHeight="251681792" behindDoc="0" locked="0" layoutInCell="1" allowOverlap="1" wp14:anchorId="02F745AB" wp14:editId="6005DAF8">
-            <wp:simplePos x="0" y="0"/>
-            <wp:positionH relativeFrom="page">
-              <wp:align>center</wp:align>
-            </wp:positionH>
-            <wp:positionV relativeFrom="paragraph">
-              <wp:posOffset>0</wp:posOffset>
-            </wp:positionV>
-            <wp:extent cx="2828925" cy="2821940"/>
-            <wp:effectExtent l="0" t="0" r="9525" b="0"/>
-            <wp:wrapTopAndBottom/>
-            <wp:docPr id="19" name="Kép 19"/>
-            <wp:cNvGraphicFramePr>
-              <a:graphicFrameLocks xmlns:a="http://schemas.openxmlformats.org/drawingml/2006/main" noChangeAspect="1"/>
-            </wp:cNvGraphicFramePr>
-            <a:graphic xmlns:a="http://schemas.openxmlformats.org/drawingml/2006/main">
-              <a:graphicData uri="http://schemas.openxmlformats.org/drawingml/2006/picture">
-                <pic:pic xmlns:pic="http://schemas.openxmlformats.org/drawingml/2006/picture">
-                  <pic:nvPicPr>
-                    <pic:cNvPr id="1" name=""/>
-                    <pic:cNvPicPr/>
-                  </pic:nvPicPr>
-                  <pic:blipFill>
-                    <a:blip r:embed="rId22">
-                      <a:extLst>
-                        <a:ext uri="{28A0092B-C50C-407E-A947-70E740481C1C}">
-                          <a14:useLocalDpi xmlns:a14="http://schemas.microsoft.com/office/drawing/2010/main" val="0"/>
-                        </a:ext>
-                      </a:extLst>
-                    </a:blip>
-                    <a:stretch>
-                      <a:fillRect/>
-                    </a:stretch>
-                  </pic:blipFill>
-                  <pic:spPr>
-                    <a:xfrm>
-                      <a:off x="0" y="0"/>
-                      <a:ext cx="2828925" cy="2821940"/>
-                    </a:xfrm>
-                    <a:prstGeom prst="rect">
-                      <a:avLst/>
-                    </a:prstGeom>
-                  </pic:spPr>
-                </pic:pic>
-              </a:graphicData>
-            </a:graphic>
-            <wp14:sizeRelH relativeFrom="margin">
-              <wp14:pctWidth>0</wp14:pctWidth>
-            </wp14:sizeRelH>
-            <wp14:sizeRelV relativeFrom="margin">
-              <wp14:pctHeight>0</wp14:pctHeight>
-            </wp14:sizeRelV>
-          </wp:anchor>
-        </w:drawing>
-      </w:r>
-      <w:r>
-        <w:drawing>
-          <wp:anchor distT="0" distB="0" distL="114300" distR="114300" simplePos="0" relativeHeight="251682816" behindDoc="0" locked="0" layoutInCell="1" allowOverlap="1" wp14:anchorId="3C3DD532" wp14:editId="63669171">
-            <wp:simplePos x="0" y="0"/>
-            <wp:positionH relativeFrom="margin">
-              <wp:align>center</wp:align>
-            </wp:positionH>
-            <wp:positionV relativeFrom="paragraph">
-              <wp:posOffset>2938145</wp:posOffset>
-            </wp:positionV>
-            <wp:extent cx="3389630" cy="2638425"/>
-            <wp:effectExtent l="0" t="0" r="1270" b="9525"/>
-            <wp:wrapTopAndBottom/>
-            <wp:docPr id="20" name="Kép 20"/>
-            <wp:cNvGraphicFramePr>
-              <a:graphicFrameLocks xmlns:a="http://schemas.openxmlformats.org/drawingml/2006/main" noChangeAspect="1"/>
-            </wp:cNvGraphicFramePr>
-            <a:graphic xmlns:a="http://schemas.openxmlformats.org/drawingml/2006/main">
-              <a:graphicData uri="http://schemas.openxmlformats.org/drawingml/2006/picture">
-                <pic:pic xmlns:pic="http://schemas.openxmlformats.org/drawingml/2006/picture">
-                  <pic:nvPicPr>
-                    <pic:cNvPr id="1" name=""/>
-                    <pic:cNvPicPr/>
-                  </pic:nvPicPr>
-                  <pic:blipFill>
-                    <a:blip r:embed="rId23">
-                      <a:extLst>
-                        <a:ext uri="{28A0092B-C50C-407E-A947-70E740481C1C}">
-                          <a14:useLocalDpi xmlns:a14="http://schemas.microsoft.com/office/drawing/2010/main" val="0"/>
-                        </a:ext>
-                      </a:extLst>
-                    </a:blip>
-                    <a:stretch>
-                      <a:fillRect/>
-                    </a:stretch>
-                  </pic:blipFill>
-                  <pic:spPr>
-                    <a:xfrm>
-                      <a:off x="0" y="0"/>
-                      <a:ext cx="3389630" cy="2638425"/>
-                    </a:xfrm>
-                    <a:prstGeom prst="rect">
-                      <a:avLst/>
-                    </a:prstGeom>
-                  </pic:spPr>
-                </pic:pic>
-              </a:graphicData>
-            </a:graphic>
-            <wp14:sizeRelH relativeFrom="margin">
-              <wp14:pctWidth>0</wp14:pctWidth>
-            </wp14:sizeRelH>
-            <wp14:sizeRelV relativeFrom="margin">
-              <wp14:pctHeight>0</wp14:pctHeight>
-            </wp14:sizeRelV>
-          </wp:anchor>
-        </w:drawing>
-      </w:r>
     </w:p>
     <w:p>
       <w:pPr>
         <w:ind w:firstLine="0"/>
       </w:pPr>
       <w:r>
+        <w:rPr>
+          <w:noProof/>
+        </w:rPr>
         <w:lastRenderedPageBreak/>
         <w:drawing>
           <wp:anchor distT="0" distB="0" distL="114300" distR="114300" simplePos="0" relativeHeight="251679744" behindDoc="0" locked="0" layoutInCell="1" allowOverlap="1" wp14:anchorId="3445CE9C" wp14:editId="2A23E172">
@@ -6958,7 +6782,7 @@
                     <pic:cNvPicPr/>
                   </pic:nvPicPr>
                   <pic:blipFill>
-                    <a:blip r:embed="rId24">
+                    <a:blip r:embed="rId21">
                       <a:extLst>
                         <a:ext uri="{28A0092B-C50C-407E-A947-70E740481C1C}">
                           <a14:useLocalDpi xmlns:a14="http://schemas.microsoft.com/office/drawing/2010/main" val="0"/>
@@ -7018,15 +6842,25 @@
       <w:pPr>
         <w:ind w:firstLine="0"/>
       </w:pPr>
-      <w:r>
+    </w:p>
+    <w:p>
+      <w:pPr>
+        <w:spacing w:line="259" w:lineRule="auto"/>
+        <w:ind w:firstLine="0"/>
+        <w:jc w:val="left"/>
+      </w:pPr>
+      <w:r>
+        <w:rPr>
+          <w:noProof/>
+        </w:rPr>
         <w:drawing>
-          <wp:anchor distT="0" distB="0" distL="114300" distR="114300" simplePos="0" relativeHeight="251680768" behindDoc="0" locked="0" layoutInCell="1" allowOverlap="1" wp14:anchorId="172557D4" wp14:editId="42BD7762">
+          <wp:anchor distT="0" distB="0" distL="114300" distR="114300" simplePos="0" relativeHeight="251680768" behindDoc="0" locked="0" layoutInCell="1" allowOverlap="1" wp14:anchorId="172557D4" wp14:editId="4BAA98E7">
             <wp:simplePos x="0" y="0"/>
             <wp:positionH relativeFrom="page">
               <wp:align>center</wp:align>
             </wp:positionH>
             <wp:positionV relativeFrom="paragraph">
-              <wp:posOffset>3460750</wp:posOffset>
+              <wp:posOffset>3125792</wp:posOffset>
             </wp:positionV>
             <wp:extent cx="2320290" cy="3989070"/>
             <wp:effectExtent l="0" t="0" r="3810" b="0"/>
@@ -7051,7 +6885,7 @@
                     <pic:cNvPicPr/>
                   </pic:nvPicPr>
                   <pic:blipFill>
-                    <a:blip r:embed="rId25">
+                    <a:blip r:embed="rId22">
                       <a:extLst>
                         <a:ext uri="{28A0092B-C50C-407E-A947-70E740481C1C}">
                           <a14:useLocalDpi xmlns:a14="http://schemas.microsoft.com/office/drawing/2010/main" val="0"/>
@@ -7083,7 +6917,356 @@
           </wp:anchor>
         </w:drawing>
       </w:r>
-    </w:p>
+      <w:r>
+        <w:br w:type="page"/>
+      </w:r>
+    </w:p>
+    <w:p>
+      <w:pPr>
+        <w:pStyle w:val="Cmsor1"/>
+      </w:pPr>
+      <w:r>
+        <w:lastRenderedPageBreak/>
+        <w:t>Projektmenedzsment</w:t>
+      </w:r>
+    </w:p>
+    <w:p>
+      <w:pPr>
+        <w:pStyle w:val="Cmsor2"/>
+        <w:rPr>
+          <w:rStyle w:val="Cmsor2Char"/>
+        </w:rPr>
+      </w:pPr>
+      <w:r>
+        <w:rPr>
+          <w:rStyle w:val="Cmsor2Char"/>
+        </w:rPr>
+        <w:t>Jira</w:t>
+      </w:r>
+    </w:p>
+    <w:p>
+      <w:pPr>
+        <w:ind w:firstLine="0"/>
+      </w:pPr>
+      <w:r>
+        <w:t>A Jira egy széles körben használt projektmenedzsment és hibakövető rendszer. Lehetővé teszi a feladatok, hibák és fejlesztési igények nyomon követését, priorizálását és státusz szerinti kezelését.</w:t>
+      </w:r>
+    </w:p>
+    <w:p>
+      <w:pPr>
+        <w:ind w:firstLine="0"/>
+      </w:pPr>
+      <w:r>
+        <w:drawing>
+          <wp:anchor distT="0" distB="0" distL="114300" distR="114300" simplePos="0" relativeHeight="251684864" behindDoc="0" locked="0" layoutInCell="1" allowOverlap="1" wp14:anchorId="208740CE" wp14:editId="39BC9145">
+            <wp:simplePos x="0" y="0"/>
+            <wp:positionH relativeFrom="margin">
+              <wp:align>center</wp:align>
+            </wp:positionH>
+            <wp:positionV relativeFrom="paragraph">
+              <wp:posOffset>1343660</wp:posOffset>
+            </wp:positionV>
+            <wp:extent cx="3181985" cy="2970530"/>
+            <wp:effectExtent l="0" t="0" r="0" b="1270"/>
+            <wp:wrapTopAndBottom/>
+            <wp:docPr id="5" name="Kép 5"/>
+            <wp:cNvGraphicFramePr>
+              <a:graphicFrameLocks xmlns:a="http://schemas.openxmlformats.org/drawingml/2006/main" noChangeAspect="1"/>
+            </wp:cNvGraphicFramePr>
+            <a:graphic xmlns:a="http://schemas.openxmlformats.org/drawingml/2006/main">
+              <a:graphicData uri="http://schemas.openxmlformats.org/drawingml/2006/picture">
+                <pic:pic xmlns:pic="http://schemas.openxmlformats.org/drawingml/2006/picture">
+                  <pic:nvPicPr>
+                    <pic:cNvPr id="1" name=""/>
+                    <pic:cNvPicPr/>
+                  </pic:nvPicPr>
+                  <pic:blipFill>
+                    <a:blip r:embed="rId23" cstate="print">
+                      <a:extLst>
+                        <a:ext uri="{28A0092B-C50C-407E-A947-70E740481C1C}">
+                          <a14:useLocalDpi xmlns:a14="http://schemas.microsoft.com/office/drawing/2010/main" val="0"/>
+                        </a:ext>
+                      </a:extLst>
+                    </a:blip>
+                    <a:stretch>
+                      <a:fillRect/>
+                    </a:stretch>
+                  </pic:blipFill>
+                  <pic:spPr>
+                    <a:xfrm>
+                      <a:off x="0" y="0"/>
+                      <a:ext cx="3181985" cy="2970530"/>
+                    </a:xfrm>
+                    <a:prstGeom prst="rect">
+                      <a:avLst/>
+                    </a:prstGeom>
+                  </pic:spPr>
+                </pic:pic>
+              </a:graphicData>
+            </a:graphic>
+            <wp14:sizeRelH relativeFrom="margin">
+              <wp14:pctWidth>0</wp14:pctWidth>
+            </wp14:sizeRelH>
+            <wp14:sizeRelV relativeFrom="margin">
+              <wp14:pctHeight>0</wp14:pctHeight>
+            </wp14:sizeRelV>
+          </wp:anchor>
+        </w:drawing>
+      </w:r>
+      <w:r>
+        <w:t>A projekt során a feladatokat ezen a felületen keresztül osztottuk el a csapattagok között. A Jira segítségével egyértelműen rögzítettük a felelősöket, határidőket és az aktuális állapotot, így mindenki átlátható módon követhette a saját és a közös munkafolyamatok előrehaladását.</w:t>
+      </w:r>
+    </w:p>
+    <w:p>
+      <w:pPr>
+        <w:ind w:firstLine="0"/>
+        <w:jc w:val="center"/>
+      </w:pPr>
+      <w:r>
+        <w:t>A projekt kezdeténél:</w:t>
+      </w:r>
+    </w:p>
+    <w:p>
+      <w:pPr>
+        <w:ind w:firstLine="0"/>
+        <w:jc w:val="center"/>
+      </w:pPr>
+      <w:r>
+        <w:drawing>
+          <wp:anchor distT="0" distB="0" distL="114300" distR="114300" simplePos="0" relativeHeight="251685888" behindDoc="0" locked="0" layoutInCell="1" allowOverlap="1" wp14:anchorId="2413DC55" wp14:editId="0B385810">
+            <wp:simplePos x="0" y="0"/>
+            <wp:positionH relativeFrom="margin">
+              <wp:align>center</wp:align>
+            </wp:positionH>
+            <wp:positionV relativeFrom="paragraph">
+              <wp:posOffset>3061524</wp:posOffset>
+            </wp:positionV>
+            <wp:extent cx="4406265" cy="2581275"/>
+            <wp:effectExtent l="0" t="0" r="0" b="9525"/>
+            <wp:wrapTopAndBottom/>
+            <wp:docPr id="7" name="Kép 7"/>
+            <wp:cNvGraphicFramePr>
+              <a:graphicFrameLocks xmlns:a="http://schemas.openxmlformats.org/drawingml/2006/main" noChangeAspect="1"/>
+            </wp:cNvGraphicFramePr>
+            <a:graphic xmlns:a="http://schemas.openxmlformats.org/drawingml/2006/main">
+              <a:graphicData uri="http://schemas.openxmlformats.org/drawingml/2006/picture">
+                <pic:pic xmlns:pic="http://schemas.openxmlformats.org/drawingml/2006/picture">
+                  <pic:nvPicPr>
+                    <pic:cNvPr id="1" name=""/>
+                    <pic:cNvPicPr/>
+                  </pic:nvPicPr>
+                  <pic:blipFill>
+                    <a:blip r:embed="rId24">
+                      <a:extLst>
+                        <a:ext uri="{28A0092B-C50C-407E-A947-70E740481C1C}">
+                          <a14:useLocalDpi xmlns:a14="http://schemas.microsoft.com/office/drawing/2010/main" val="0"/>
+                        </a:ext>
+                      </a:extLst>
+                    </a:blip>
+                    <a:stretch>
+                      <a:fillRect/>
+                    </a:stretch>
+                  </pic:blipFill>
+                  <pic:spPr>
+                    <a:xfrm>
+                      <a:off x="0" y="0"/>
+                      <a:ext cx="4406265" cy="2581275"/>
+                    </a:xfrm>
+                    <a:prstGeom prst="rect">
+                      <a:avLst/>
+                    </a:prstGeom>
+                  </pic:spPr>
+                </pic:pic>
+              </a:graphicData>
+            </a:graphic>
+            <wp14:sizeRelH relativeFrom="margin">
+              <wp14:pctWidth>0</wp14:pctWidth>
+            </wp14:sizeRelH>
+            <wp14:sizeRelV relativeFrom="margin">
+              <wp14:pctHeight>0</wp14:pctHeight>
+            </wp14:sizeRelV>
+          </wp:anchor>
+        </w:drawing>
+      </w:r>
+      <w:r>
+        <w:t>A projekt közben:</w:t>
+      </w:r>
+    </w:p>
+    <w:p>
+      <w:pPr>
+        <w:ind w:firstLine="0"/>
+        <w:jc w:val="center"/>
+      </w:pPr>
+      <w:r>
+        <w:lastRenderedPageBreak/>
+        <w:drawing>
+          <wp:anchor distT="0" distB="0" distL="114300" distR="114300" simplePos="0" relativeHeight="251686912" behindDoc="0" locked="0" layoutInCell="1" allowOverlap="1" wp14:anchorId="73004103" wp14:editId="08E44A7A">
+            <wp:simplePos x="0" y="0"/>
+            <wp:positionH relativeFrom="margin">
+              <wp:align>center</wp:align>
+            </wp:positionH>
+            <wp:positionV relativeFrom="margin">
+              <wp:posOffset>203464</wp:posOffset>
+            </wp:positionV>
+            <wp:extent cx="3148330" cy="2698115"/>
+            <wp:effectExtent l="0" t="0" r="0" b="6985"/>
+            <wp:wrapTopAndBottom/>
+            <wp:docPr id="13" name="Kép 13"/>
+            <wp:cNvGraphicFramePr>
+              <a:graphicFrameLocks xmlns:a="http://schemas.openxmlformats.org/drawingml/2006/main" noChangeAspect="1"/>
+            </wp:cNvGraphicFramePr>
+            <a:graphic xmlns:a="http://schemas.openxmlformats.org/drawingml/2006/main">
+              <a:graphicData uri="http://schemas.openxmlformats.org/drawingml/2006/picture">
+                <pic:pic xmlns:pic="http://schemas.openxmlformats.org/drawingml/2006/picture">
+                  <pic:nvPicPr>
+                    <pic:cNvPr id="1" name=""/>
+                    <pic:cNvPicPr/>
+                  </pic:nvPicPr>
+                  <pic:blipFill>
+                    <a:blip r:embed="rId25" cstate="print">
+                      <a:extLst>
+                        <a:ext uri="{28A0092B-C50C-407E-A947-70E740481C1C}">
+                          <a14:useLocalDpi xmlns:a14="http://schemas.microsoft.com/office/drawing/2010/main" val="0"/>
+                        </a:ext>
+                      </a:extLst>
+                    </a:blip>
+                    <a:stretch>
+                      <a:fillRect/>
+                    </a:stretch>
+                  </pic:blipFill>
+                  <pic:spPr>
+                    <a:xfrm>
+                      <a:off x="0" y="0"/>
+                      <a:ext cx="3148330" cy="2698115"/>
+                    </a:xfrm>
+                    <a:prstGeom prst="rect">
+                      <a:avLst/>
+                    </a:prstGeom>
+                  </pic:spPr>
+                </pic:pic>
+              </a:graphicData>
+            </a:graphic>
+            <wp14:sizeRelH relativeFrom="margin">
+              <wp14:pctWidth>0</wp14:pctWidth>
+            </wp14:sizeRelH>
+            <wp14:sizeRelV relativeFrom="margin">
+              <wp14:pctHeight>0</wp14:pctHeight>
+            </wp14:sizeRelV>
+          </wp:anchor>
+        </w:drawing>
+      </w:r>
+      <w:r>
+        <w:t>A projekt befejezésénél:</w:t>
+      </w:r>
+    </w:p>
+    <w:p>
+      <w:pPr>
+        <w:pStyle w:val="Cmsor2"/>
+      </w:pPr>
+      <w:r>
+        <w:t>Git &amp; Github</w:t>
+      </w:r>
+    </w:p>
+    <w:p>
+      <w:pPr>
+        <w:ind w:firstLine="0"/>
+      </w:pPr>
+      <w:r>
+        <w:t xml:space="preserve">A </w:t>
+      </w:r>
+      <w:r>
+        <w:rPr>
+          <w:b/>
+          <w:bCs/>
+        </w:rPr>
+        <w:t>GitHub</w:t>
+      </w:r>
+      <w:r>
+        <w:t xml:space="preserve"> egy </w:t>
+      </w:r>
+      <w:r>
+        <w:rPr>
+          <w:b/>
+          <w:bCs/>
+        </w:rPr>
+        <w:t>webalapú</w:t>
+      </w:r>
+      <w:r>
+        <w:t xml:space="preserve"> verziókezelő és együttműködési platform, amely a </w:t>
+      </w:r>
+      <w:r>
+        <w:rPr>
+          <w:b/>
+          <w:bCs/>
+        </w:rPr>
+        <w:t>Git</w:t>
+      </w:r>
+      <w:r>
+        <w:t xml:space="preserve"> rendszerre épül. Lehetővé teszi a </w:t>
+      </w:r>
+      <w:r>
+        <w:rPr>
+          <w:b/>
+          <w:bCs/>
+        </w:rPr>
+        <w:t>forráskód tárolását</w:t>
+      </w:r>
+      <w:r>
+        <w:t xml:space="preserve">, </w:t>
+      </w:r>
+      <w:r>
+        <w:rPr>
+          <w:b/>
+          <w:bCs/>
+        </w:rPr>
+        <w:t>verziókövetését</w:t>
+      </w:r>
+      <w:r>
+        <w:t xml:space="preserve">, valamint a </w:t>
+      </w:r>
+      <w:r>
+        <w:rPr>
+          <w:b/>
+          <w:bCs/>
+        </w:rPr>
+        <w:t>csapattagok közötti közös fejlesztést</w:t>
+      </w:r>
+      <w:r>
+        <w:t xml:space="preserve"> és </w:t>
+      </w:r>
+      <w:r>
+        <w:rPr>
+          <w:b/>
+          <w:bCs/>
+        </w:rPr>
+        <w:t>kódellenőrzést</w:t>
+      </w:r>
+      <w:r>
+        <w:t>.</w:t>
+      </w:r>
+    </w:p>
+    <w:p>
+      <w:pPr>
+        <w:ind w:firstLine="0"/>
+      </w:pPr>
+      <w:r>
+        <w:t xml:space="preserve">A projekt során a </w:t>
+      </w:r>
+      <w:r>
+        <w:rPr>
+          <w:b/>
+          <w:bCs/>
+        </w:rPr>
+        <w:t>GitHub</w:t>
+      </w:r>
+      <w:r>
+        <w:t xml:space="preserve"> </w:t>
+      </w:r>
+      <w:r>
+        <w:t>felületén kezeltük a teljes forráskódot, itt hoztuk létre és egyesítettük a brancheket, valamint pull requesteken keresztül végeztük a kódellenőrzést. A feladatokhoz kapcsolódó módosításokat itt dokumentáltuk, így a fejlesztési folyamat átlátható és visszakövethető maradt a csapat minden tagja számára.</w:t>
+      </w:r>
+    </w:p>
+    <w:p/>
     <w:sectPr>
       <w:footerReference w:type="default" r:id="rId26"/>
       <w:pgSz w:w="11906" w:h="16838"/>
@@ -11126,7 +11309,6 @@
   <w:style w:type="character" w:default="1" w:styleId="Bekezdsalapbettpusa">
     <w:name w:val="Default Paragraph Font"/>
     <w:uiPriority w:val="1"/>
-    <w:semiHidden/>
     <w:unhideWhenUsed/>
   </w:style>
   <w:style w:type="table" w:default="1" w:styleId="Normltblzat">

</xml_diff>